<commit_message>
Tweaks to manual guide
</commit_message>
<xml_diff>
--- a/docs/Libstar-Manual-Guide-2026-Release.docx
+++ b/docs/Libstar-Manual-Guide-2026-Release.docx
@@ -56,27 +56,13 @@
         </w:rPr>
         <w:t>ClassRequest</w:t>
       </w:r>
+      <w:r>
+        <w:rPr>
+          <w:rFonts w:ascii="IBM Plex Sans Condensed" w:hAnsi="IBM Plex Sans Condensed" w:cs="IBM Plex Sans Condensed"/>
+        </w:rPr>
+        <w:t>s</w:t>
+      </w:r>
       <w:proofErr w:type="spellEnd"/>
-      <w:r>
-        <w:rPr>
-          <w:rFonts w:ascii="IBM Plex Sans Condensed" w:hAnsi="IBM Plex Sans Condensed" w:cs="IBM Plex Sans Condensed"/>
-        </w:rPr>
-        <w:t xml:space="preserve"> / </w:t>
-      </w:r>
-      <w:proofErr w:type="spellStart"/>
-      <w:r>
-        <w:rPr>
-          <w:rFonts w:ascii="IBM Plex Sans Condensed" w:hAnsi="IBM Plex Sans Condensed" w:cs="IBM Plex Sans Condensed"/>
-        </w:rPr>
-        <w:t>Libstar</w:t>
-      </w:r>
-      <w:proofErr w:type="spellEnd"/>
-      <w:r>
-        <w:rPr>
-          <w:rFonts w:ascii="IBM Plex Sans Condensed" w:hAnsi="IBM Plex Sans Condensed" w:cs="IBM Plex Sans Condensed"/>
-        </w:rPr>
-        <w:t xml:space="preserve"> </w:t>
-      </w:r>
     </w:p>
     <w:p>
       <w:pPr>
@@ -89,7 +75,19 @@
         <w:rPr>
           <w:rFonts w:ascii="IBM Plex Sans Condensed" w:hAnsi="IBM Plex Sans Condensed" w:cs="IBM Plex Sans Condensed"/>
         </w:rPr>
-        <w:t>Teaching Request Guide</w:t>
+        <w:t xml:space="preserve">Teaching Request </w:t>
+      </w:r>
+      <w:r>
+        <w:rPr>
+          <w:rFonts w:ascii="IBM Plex Sans Condensed" w:hAnsi="IBM Plex Sans Condensed" w:cs="IBM Plex Sans Condensed"/>
+        </w:rPr>
+        <w:t xml:space="preserve">Manual | </w:t>
+      </w:r>
+      <w:r>
+        <w:rPr>
+          <w:rFonts w:ascii="IBM Plex Sans Condensed" w:hAnsi="IBM Plex Sans Condensed" w:cs="IBM Plex Sans Condensed"/>
+        </w:rPr>
+        <w:t>Guide</w:t>
       </w:r>
     </w:p>
     <w:p>
@@ -150,7 +148,7 @@
           </mc:Choice>
           <mc:Fallback>
             <w:pict>
-              <v:line w14:anchorId="48AB1BD4" id="Straight Connector 2" o:spid="_x0000_s1026" style="position:absolute;z-index:251659264;visibility:visible;mso-wrap-style:square;mso-wrap-distance-left:9pt;mso-wrap-distance-top:0;mso-wrap-distance-right:9pt;mso-wrap-distance-bottom:0;mso-position-horizontal:absolute;mso-position-horizontal-relative:text;mso-position-vertical:absolute;mso-position-vertical-relative:text" from="2.25pt,3.35pt" to="437.95pt,3.35pt" o:gfxdata="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" strokecolor="#c0504d [3205]" strokeweight="2pt"/>
+              <v:line w14:anchorId="11EDE172" id="Straight Connector 2" o:spid="_x0000_s1026" style="position:absolute;z-index:251659264;visibility:visible;mso-wrap-style:square;mso-wrap-distance-left:9pt;mso-wrap-distance-top:0;mso-wrap-distance-right:9pt;mso-wrap-distance-bottom:0;mso-position-horizontal:absolute;mso-position-horizontal-relative:text;mso-position-vertical:absolute;mso-position-vertical-relative:text" from="2.25pt,3.35pt" to="437.95pt,3.35pt" o:gfxdata="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" strokecolor="#c0504d [3205]" strokeweight="2pt"/>
             </w:pict>
           </mc:Fallback>
         </mc:AlternateContent>
@@ -258,7 +256,25 @@
           <w:sz w:val="20"/>
           <w:szCs w:val="20"/>
         </w:rPr>
-        <w:t>York University Libraries | August 2026</w:t>
+        <w:t xml:space="preserve">York University Libraries | </w:t>
+      </w:r>
+      <w:r>
+        <w:rPr>
+          <w:b/>
+          <w:color w:val="637083"/>
+          <w:sz w:val="20"/>
+          <w:szCs w:val="20"/>
+        </w:rPr>
+        <w:t>May - Sept</w:t>
+      </w:r>
+      <w:r>
+        <w:rPr>
+          <w:b/>
+          <w:color w:val="637083"/>
+          <w:sz w:val="20"/>
+          <w:szCs w:val="20"/>
+        </w:rPr>
+        <w:t xml:space="preserve"> 2026</w:t>
       </w:r>
     </w:p>
     <w:p>
@@ -395,7 +411,7 @@
           <w:b/>
           <w:color w:val="1A6B78"/>
         </w:rPr>
-        <w:t>Database Structure (Workflow Scope)</w:t>
+        <w:t>A Note About Unfulfilled Requests</w:t>
       </w:r>
     </w:p>
     <w:p>
@@ -410,37 +426,7 @@
           <w:b/>
           <w:color w:val="1A6B78"/>
         </w:rPr>
-        <w:t>A Note About Unfulfilled Requests</w:t>
-      </w:r>
-    </w:p>
-    <w:p>
-      <w:pPr>
-        <w:spacing w:after="100" w:line="280" w:lineRule="auto"/>
-        <w:rPr>
-          <w:rFonts w:hint="eastAsia"/>
-        </w:rPr>
-      </w:pPr>
-      <w:r>
-        <w:rPr>
-          <w:b/>
-          <w:color w:val="1A6B78"/>
-        </w:rPr>
         <w:t>Technical Acceptance Checklist</w:t>
-      </w:r>
-    </w:p>
-    <w:p>
-      <w:pPr>
-        <w:spacing w:after="100" w:line="280" w:lineRule="auto"/>
-        <w:rPr>
-          <w:rFonts w:hint="eastAsia"/>
-        </w:rPr>
-      </w:pPr>
-      <w:r>
-        <w:rPr>
-          <w:b/>
-          <w:color w:val="1A6B78"/>
-        </w:rPr>
-        <w:t>Phase 7: Staging Review and Client Demo</w:t>
       </w:r>
     </w:p>
     <w:p>
@@ -639,9 +625,13 @@
               <w:spacing w:after="60" w:line="280" w:lineRule="auto"/>
               <w:rPr>
                 <w:rFonts w:hint="eastAsia"/>
+                <w:color w:val="FFFFFF" w:themeColor="background1"/>
               </w:rPr>
             </w:pPr>
             <w:r>
+              <w:rPr>
+                <w:color w:val="FFFFFF" w:themeColor="background1"/>
+              </w:rPr>
               <w:t>Status</w:t>
             </w:r>
           </w:p>
@@ -657,9 +647,13 @@
               <w:spacing w:after="60" w:line="280" w:lineRule="auto"/>
               <w:rPr>
                 <w:rFonts w:hint="eastAsia"/>
+                <w:color w:val="FFFFFF" w:themeColor="background1"/>
               </w:rPr>
             </w:pPr>
             <w:r>
+              <w:rPr>
+                <w:color w:val="FFFFFF" w:themeColor="background1"/>
+              </w:rPr>
               <w:t>What it means</w:t>
             </w:r>
           </w:p>
@@ -3510,22 +3504,63 @@
         <w:color w:val="66717D"/>
         <w:sz w:val="17"/>
       </w:rPr>
+      <w:tab/>
+    </w:r>
+    <w:r>
+      <w:rPr>
+        <w:color w:val="66717D"/>
+        <w:sz w:val="17"/>
+      </w:rPr>
+      <w:tab/>
+    </w:r>
+    <w:r>
+      <w:rPr>
+        <w:color w:val="66717D"/>
+        <w:sz w:val="17"/>
+      </w:rPr>
       <w:t xml:space="preserve">Page </w:t>
     </w:r>
     <w:r>
+      <w:rPr>
+        <w:color w:val="66717D"/>
+        <w:sz w:val="17"/>
+      </w:rPr>
       <w:fldChar w:fldCharType="begin"/>
     </w:r>
     <w:r>
+      <w:rPr>
+        <w:color w:val="66717D"/>
+        <w:sz w:val="17"/>
+      </w:rPr>
       <w:instrText>PAGE</w:instrText>
     </w:r>
     <w:r>
+      <w:rPr>
+        <w:color w:val="66717D"/>
+        <w:sz w:val="17"/>
+      </w:rPr>
       <w:fldChar w:fldCharType="separate"/>
     </w:r>
     <w:r>
+      <w:rPr>
+        <w:color w:val="66717D"/>
+        <w:sz w:val="17"/>
+      </w:rPr>
       <w:t>1</w:t>
     </w:r>
     <w:r>
+      <w:rPr>
+        <w:color w:val="66717D"/>
+        <w:sz w:val="17"/>
+      </w:rPr>
       <w:fldChar w:fldCharType="end"/>
+    </w:r>
+    <w:r>
+      <w:rPr>
+        <w:color w:val="66717D"/>
+        <w:sz w:val="17"/>
+      </w:rPr>
+      <w:t xml:space="preserve"> / 9</w:t>
     </w:r>
   </w:p>
 </w:ftr>
@@ -3580,23 +3615,29 @@
       </w:rPr>
       <w:t xml:space="preserve">LIBSTAR 2026 TEACHING REQUEST </w:t>
     </w:r>
-    <w:proofErr w:type="gramStart"/>
     <w:r>
       <w:rPr>
         <w:b/>
         <w:color w:val="66717D"/>
         <w:sz w:val="16"/>
       </w:rPr>
-      <w:t>GUIDE  |</w:t>
+      <w:t xml:space="preserve">MANUAL </w:t>
     </w:r>
-    <w:proofErr w:type="gramEnd"/>
     <w:r>
       <w:rPr>
         <w:b/>
         <w:color w:val="66717D"/>
         <w:sz w:val="16"/>
       </w:rPr>
-      <w:t xml:space="preserve">  STAFF REFERENCE</w:t>
+      <w:t>| STAFF</w:t>
+    </w:r>
+    <w:r>
+      <w:rPr>
+        <w:b/>
+        <w:color w:val="66717D"/>
+        <w:sz w:val="16"/>
+      </w:rPr>
+      <w:t xml:space="preserve"> REFERENCE</w:t>
     </w:r>
   </w:p>
 </w:hdr>

</xml_diff>